<commit_message>
docs: actualiza riesgo tecnico principal, HU-05 y rol de pruebas en portafolio
</commit_message>
<xml_diff>
--- a/Portafolio_de_Proyecto_hito3_2026.docx
+++ b/Portafolio_de_Proyecto_hito3_2026.docx
@@ -8371,47 +8371,13 @@
               <w:jc w:val="left"/>
               <w:rPr/>
             </w:pPr>
-            <w:r>
-              <w:rPr>
-                <w:b w:val="1"/>
-                <w:bCs w:val="1"/>
-                <w:rtl w:val="0"/>
-              </w:rPr>
-              <w:t xml:space="preserve">Como</w:t>
-            </w:r>
-            <w:r>
-              <w:rPr>
-                <w:rtl w:val="0"/>
-              </w:rPr>
-              <w:t xml:space="preserve"> administrador, </w:t>
-            </w:r>
-            <w:r>
-              <w:rPr>
-                <w:b w:val="1"/>
-                <w:bCs w:val="1"/>
-                <w:rtl w:val="0"/>
-              </w:rPr>
-              <w:t xml:space="preserve">quiero</w:t>
-            </w:r>
-            <w:r>
-              <w:rPr>
-                <w:rtl w:val="0"/>
-              </w:rPr>
-              <w:t xml:space="preserve"> registrar los datos de consulta </w:t>
-            </w:r>
-            <w:r>
-              <w:rPr>
-                <w:b w:val="1"/>
-                <w:bCs w:val="1"/>
-                <w:rtl w:val="0"/>
-              </w:rPr>
-              <w:t xml:space="preserve">para</w:t>
-            </w:r>
-            <w:r>
-              <w:rPr>
-                <w:rtl w:val="0"/>
-              </w:rPr>
-              <w:t xml:space="preserve"> generar métricas.</w:t>
+            <w:r/>
+            <w:r>
+              <w:rPr>
+                <w:rFonts w:ascii="Arial" w:hAnsi="Arial"/>
+                <w:sz w:val="20"/>
+              </w:rPr>
+              <w:t>Como responsable del proyecto, deseo registrar los datos de consulta para generar métricas.</w:t>
             </w:r>
           </w:p>
         </w:tc>
@@ -12654,12 +12620,13 @@
             <w:pPr>
               <w:spacing w:before="0" w:after="40" w:line="276" w:lineRule="auto"/>
             </w:pPr>
+            <w:r/>
             <w:r>
               <w:rPr>
                 <w:rFonts w:ascii="Arial" w:hAnsi="Arial"/>
-                <w:sz w:val="19"/>
-              </w:rPr>
-              <w:t>Responsable QA</w:t>
+                <w:sz w:val="20"/>
+              </w:rPr>
+              <w:t>Responsable de pruebas</w:t>
             </w:r>
           </w:p>
         </w:tc>
@@ -15268,12 +15235,13 @@
       <w:pPr>
         <w:spacing w:before="120" w:after="120" w:line="276" w:lineRule="auto"/>
       </w:pPr>
+      <w:r/>
       <w:r>
         <w:rPr>
           <w:rFonts w:ascii="Arial" w:hAnsi="Arial"/>
           <w:sz w:val="22"/>
         </w:rPr>
-        <w:t>Infraestructura Cloud (AWS): Se proyecta el despliegue del MVP en la nube mediante Amazon ECS Fargate y Amazon RDS PostgreSQL. AWS fue seleccionado por su alta disponibilidad, elasticidad operacional y capacidad para ejecutar contenedores sin necesidad de administrar servidores físicos EC2 (servicios serverless), integrando un Application Load Balancer con certificados SSL y almacenamiento persistente seguro.</w:t>
+        <w:t>Infraestructura Cloud (AWS): Se proyecta el despliegue del MVP en la nube mediante Amazon ECS Fargate y Amazon RDS PostgreSQL. AWS fue seleccionado por su alta disponibilidad, elasticidad operacional y capacidad para ejecutar contenedores sin administrar servidores físicos EC2 (servicios serverless), integrando un Application Load Balancer con certificados SSL y almacenamiento persistente seguro. Este diseño de infraestructura está preparado para ser 100% portable y escalable, por lo que la transición del entorno local a AWS es inmediata (lista para llegar e implementar) al levantarse sobre las mismas imágenes de contenedores Docker.</w:t>
       </w:r>
     </w:p>
     <w:p>
@@ -15441,11 +15409,13 @@
         <w:spacing w:after="240" w:before="240" w:lineRule="auto"/>
         <w:rPr/>
       </w:pPr>
-      <w:r>
-        <w:rPr>
-          <w:rtl w:val="0"/>
-        </w:rPr>
-        <w:t xml:space="preserve">En fases subsiguientes, la infraestructura de desarrollo se proyectará hacia un despliegue escalable en AWS, preservando la coherencia lógica de los contenedores y la gobernanza por variables de entorno. Esta definición técnica permite consolidar inicialmente un prototipo de ingeniería controlado, facilitando la evolución incremental hacia una versión robusta del bot sin comprometer la estabilidad ni la base tecnológica original del proyecto.</w:t>
+      <w:r/>
+      <w:r>
+        <w:rPr>
+          <w:rFonts w:ascii="Arial" w:hAnsi="Arial"/>
+          <w:sz w:val="22"/>
+        </w:rPr>
+        <w:t>En fases subsiguientes, la infraestructura de desarrollo se proyectará hacia un despliegue escalable en AWS, preservando la coherencia lógica de los contenedores y la gobernanza por variables de entorno. Al estar el backend y la base de datos completamente contenerizados mediante Docker, la migración a servicios en la nube como Amazon ECS Fargate y Amazon RDS no requiere modificaciones en el código base, sino únicamente conectar los contenedores a los endpoints de producción correspondientes (listo para llegar e implementar), logrando una arquitectura 100% portable y escalable.</w:t>
       </w:r>
     </w:p>
     <w:p>
@@ -15487,11 +15457,13 @@
         <w:spacing w:after="240" w:before="240" w:lineRule="auto"/>
         <w:rPr/>
       </w:pPr>
-      <w:r>
-        <w:rPr>
-          <w:rtl w:val="0"/>
-        </w:rPr>
-        <w:t xml:space="preserve">La mitigación del riesgo técnico se focaliza en un imperativo crítico para el éxito del MVP Bot Verificador X: la posibilidad de que el motor de análisis emita veredictos imprecisos, descontextualizados o carentes de matices frente a información de alta sensibilidad. Este riesgo adquiere una relevancia estratégica, dado que la propuesta de valor del sistema reside en proveer respuestas responsables, útiles y transparentes que impacten positivamente en la interacción ciudadana dentro de la plataforma X.</w:t>
+      <w:r/>
+      <w:r>
+        <w:rPr>
+          <w:rFonts w:ascii="Arial" w:hAnsi="Arial"/>
+          <w:sz w:val="22"/>
+        </w:rPr>
+        <w:t>La mitigación del riesgo técnico se focaliza en un imperativo crítico para el éxito del MVP Bot Verificador X: la posibilidad de una falla de integración en los protocolos de comunicación entre el entorno de X, el backend Express y el servicio externo de NLP/IA (Gemini). Si alguna de estas conexiones sufre latencia extrema o indisponibilidad física, el flujo transaccional colapsaría, impidiendo emitir respuestas automáticas y afectando la disponibilidad operativa del bot.</w:t>
       </w:r>
     </w:p>
     <w:p>
@@ -15499,11 +15471,13 @@
         <w:spacing w:after="240" w:before="240" w:lineRule="auto"/>
         <w:rPr/>
       </w:pPr>
-      <w:r>
-        <w:rPr>
-          <w:rtl w:val="0"/>
-        </w:rPr>
-        <w:t xml:space="preserve">Si el agente automatizado operará exclusivamente mediante etiquetas binarias como “Verdadero” o “Falso”, se omitiría el análisis de las señales y el contexto sociopolítico que sustenta cada veredicto, induciendo potencialmente a una falsa certidumbre. En consecuencia, la estrategia de mitigación no se restringe a la supervisión de los umbrales de confianza del modelo NLP; integra, además, una respuesta estructurada que explicite el tema identificado, la justificación del veredicto, las señales de alerta consideradas y una recomendación orientada al pensamiento crítico del usuario.</w:t>
+      <w:r/>
+      <w:r>
+        <w:rPr>
+          <w:rFonts w:ascii="Arial" w:hAnsi="Arial"/>
+          <w:sz w:val="22"/>
+        </w:rPr>
+        <w:t>Para mitigar este escenario de falla de integración, la arquitectura del sistema implementa un temporizador asíncrono estructurado con reintentos rápidos y conmutación automática (fallback) en caliente. Si el canal externo falla de forma persistente, el orquestador desvía la consulta hacia un simulador local en memoria dotado de análisis semántico, garantizando que el bot nunca quede inactivo y mantenga una disponibilidad de respuesta estable ante caídas de red externas.</w:t>
       </w:r>
     </w:p>
     <w:p>
@@ -15678,11 +15652,13 @@
               <w:spacing w:line="240" w:lineRule="auto"/>
               <w:rPr/>
             </w:pPr>
-            <w:r>
-              <w:rPr>
-                <w:rtl w:val="0"/>
-              </w:rPr>
-              <w:t xml:space="preserve">Veredictos poco confiables o sin contexto suficiente</w:t>
+            <w:r/>
+            <w:r>
+              <w:rPr>
+                <w:rFonts w:ascii="Arial" w:hAnsi="Arial"/>
+                <w:sz w:val="20"/>
+              </w:rPr>
+              <w:t>Falla de integración entre X, backend y servicio NLP/IA</w:t>
             </w:r>
           </w:p>
         </w:tc>
@@ -15693,11 +15669,13 @@
               <w:spacing w:line="240" w:lineRule="auto"/>
               <w:rPr/>
             </w:pPr>
-            <w:r>
-              <w:rPr>
-                <w:rtl w:val="0"/>
-              </w:rPr>
-              <w:t xml:space="preserve">Emisión de respuestas excesivamente simplificadas o erróneas ante publicaciones dudosas, comprometiendo la credibilidad del agente y su capacidad para mitigar la desinformación.</w:t>
+            <w:r/>
+            <w:r>
+              <w:rPr>
+                <w:rFonts w:ascii="Arial" w:hAnsi="Arial"/>
+                <w:sz w:val="20"/>
+              </w:rPr>
+              <w:t>Incompatibilidad o desconexión en los protocolos de comunicación entre la API de X, el servidor backend Express y la API externa del servicio de NLP/IA (Gemini), provocando la interrupción del flujo transaccional y la imposibilidad de responder al usuario.</w:t>
             </w:r>
           </w:p>
         </w:tc>
@@ -15760,53 +15738,13 @@
         <w:spacing w:after="240" w:before="240" w:lineRule="auto"/>
         <w:rPr/>
       </w:pPr>
-      <w:r>
-        <w:rPr>
-          <w:rtl w:val="0"/>
-        </w:rPr>
-        <w:t xml:space="preserve">Con el propósito de determinar la estrategia de mitigación de mayor efectividad, se sometieron a evaluación diversas alternativas técnicas orientadas a reducir la probabilidad de emitir veredictos poco confiables o carentes de profundidad explicativa. La primera opción estratégica consistía en limitar la salida sistémica de forma binaria o mediante tres etiquetas de clasificación rígidas: </w:t>
-      </w:r>
-      <w:r>
-        <w:rPr>
-          <w:i w:val="1"/>
-          <w:iCs w:val="1"/>
-          <w:rtl w:val="0"/>
-        </w:rPr>
-        <w:t xml:space="preserve">Verdadero</w:t>
-      </w:r>
-      <w:r>
-        <w:rPr>
-          <w:rtl w:val="0"/>
-        </w:rPr>
-        <w:t xml:space="preserve">, </w:t>
-      </w:r>
-      <w:r>
-        <w:rPr>
-          <w:i w:val="1"/>
-          <w:iCs w:val="1"/>
-          <w:rtl w:val="0"/>
-        </w:rPr>
-        <w:t xml:space="preserve">Falso</w:t>
-      </w:r>
-      <w:r>
-        <w:rPr>
-          <w:rtl w:val="0"/>
-        </w:rPr>
-        <w:t xml:space="preserve"> e </w:t>
-      </w:r>
-      <w:r>
-        <w:rPr>
-          <w:i w:val="1"/>
-          <w:iCs w:val="1"/>
-          <w:rtl w:val="0"/>
-        </w:rPr>
-        <w:t xml:space="preserve">Impreciso</w:t>
-      </w:r>
-      <w:r>
-        <w:rPr>
-          <w:rtl w:val="0"/>
-        </w:rPr>
-        <w:t xml:space="preserve">. Si bien este enfoque optimiza la complejidad de implementación en el backend, se determinó que resulta insuficiente, dado que no provee al ciudadano de la justificación técnica necesaria para comprender la naturaleza del veredicto ni el contexto sociopolítico de la afirmación sometida a análisis.</w:t>
+      <w:r/>
+      <w:r>
+        <w:rPr>
+          <w:rFonts w:ascii="Arial" w:hAnsi="Arial"/>
+          <w:sz w:val="22"/>
+        </w:rPr>
+        <w:t>Con el propósito de determinar la estrategia de mitigación de mayor efectividad ante una falla de integración, se sometieron a evaluación diversas alternativas técnicas. La primera opción estratégica consistía en programar reintentos sínconos continuos de la petición HTTP hacia la API externa. Si bien esta alternativa busca persistir en la conexión real con Gemini, se determinó que incrementa drásticamente la latencia total del flujo de verificación superando el umbral de los 40 segundos, bloqueando recursos del servidor Express ante altas demandas.</w:t>
       </w:r>
     </w:p>
     <w:p>
@@ -15814,11 +15752,13 @@
         <w:spacing w:after="240" w:before="240" w:lineRule="auto"/>
         <w:rPr/>
       </w:pPr>
-      <w:r>
-        <w:rPr>
-          <w:rtl w:val="0"/>
-        </w:rPr>
-        <w:t xml:space="preserve">Una segunda alternativa evaluada contemplaba la inhibición total de la respuesta automatizada en aquellos escenarios donde el motor NLP no lograra superar un umbral de certidumbre elevado. Aunque esta medida mitiga de forma drástica el riesgo de propagar clasificaciones erróneas, afecta negativamente la propuesta de valor y utilidad del bot; lo anterior, por cuanto deja al usuario desprovisto de orientación precisamente en situaciones de alta incertidumbre, donde la necesidad de asistencia técnica para la validación previa al clic es más crítica.</w:t>
+      <w:r/>
+      <w:r>
+        <w:rPr>
+          <w:rFonts w:ascii="Arial" w:hAnsi="Arial"/>
+          <w:sz w:val="22"/>
+        </w:rPr>
+        <w:t>Una segunda alternativa evaluada contemplaba suspender el servicio y responder con un mensaje de error genérico al usuario ante fallas en los sockets externos. Aunque esta medida es simple y evita entregar veredictos basados en reglas locales predefinidas, afecta negativamente la propuesta de valor y utilidad de cero fricción del bot, dejando al usuario desatendido precisamente ante contingencias operativas.</w:t>
       </w:r>
     </w:p>
     <w:p>
@@ -15826,11 +15766,13 @@
         <w:spacing w:after="240" w:before="240" w:lineRule="auto"/>
         <w:rPr/>
       </w:pPr>
-      <w:r>
-        <w:rPr>
-          <w:rtl w:val="0"/>
-        </w:rPr>
-        <w:t xml:space="preserve">La tercera alternativa, adoptada formalmente para el desarrollo del prototipo de ingeniería, integra el control de umbrales de confianza con una respuesta estructural contextualizada. Bajo esta arquitectura de solución, el sistema orquesta no solo la entrega del veredicto y su porcentaje de certidumbre, sino que incorpora de forma mandatoria el dominio temático, el contexto de la publicación, las señales de alerta evaluadas y una recomendación final. Esta estrategia fue seleccionada debido a que preserva la utilidad operacional para el usuario, maximiza la transparencia del procesamiento cognitivo y reduce significativamente la incidencia de respuestas categóricas carentes de respaldo técnico suficiente.</w:t>
+      <w:r/>
+      <w:r>
+        <w:rPr>
+          <w:rFonts w:ascii="Arial" w:hAnsi="Arial"/>
+          <w:sz w:val="22"/>
+        </w:rPr>
+        <w:t>La tercera alternativa, adoptada formalmente para el desarrollo del prototipo de ingeniería, integra un timeout agresivo con AbortController, conmutación rápida a un simulador semántico en memoria y persistencia de desvío asíncrono para las métricas en caso de indisponibilidad de PostgreSQL. Esta estrategia fue seleccionada debido a que equilibra la continuidad del servicio, garantiza respuestas en menos de 5 segundos ante fallas de red y previene la pérdida de trazas operacionales.</w:t>
       </w:r>
     </w:p>
     <w:p>
@@ -16052,11 +15994,13 @@
               <w:spacing w:after="480" w:line="276" w:lineRule="auto"/>
               <w:rPr/>
             </w:pPr>
-            <w:r>
-              <w:rPr>
-                <w:rtl w:val="0"/>
-              </w:rPr>
-              <w:t xml:space="preserve">Respuesta solo con veredicto</w:t>
+            <w:r/>
+            <w:r>
+              <w:rPr>
+                <w:rFonts w:ascii="Arial" w:hAnsi="Arial"/>
+                <w:sz w:val="20"/>
+              </w:rPr>
+              <w:t>Fallback automático a simulador local en memoria</w:t>
             </w:r>
           </w:p>
         </w:tc>
@@ -16081,11 +16025,13 @@
               <w:spacing w:after="480" w:line="276" w:lineRule="auto"/>
               <w:rPr/>
             </w:pPr>
-            <w:r>
-              <w:rPr>
-                <w:rtl w:val="0"/>
-              </w:rPr>
-              <w:t xml:space="preserve">Implementación simple y rápida</w:t>
+            <w:r/>
+            <w:r>
+              <w:rPr>
+                <w:rFonts w:ascii="Arial" w:hAnsi="Arial"/>
+                <w:sz w:val="20"/>
+              </w:rPr>
+              <w:t>Garantiza la respuesta operativa del bot ante caídas de red de la API externa (Gemini/X).</w:t>
             </w:r>
           </w:p>
         </w:tc>
@@ -16110,11 +16056,13 @@
               <w:spacing w:after="480" w:line="276" w:lineRule="auto"/>
               <w:rPr/>
             </w:pPr>
-            <w:r>
-              <w:rPr>
-                <w:rtl w:val="0"/>
-              </w:rPr>
-              <w:t xml:space="preserve">No explica contexto ni señales del análisis</w:t>
+            <w:r/>
+            <w:r>
+              <w:rPr>
+                <w:rFonts w:ascii="Arial" w:hAnsi="Arial"/>
+                <w:sz w:val="20"/>
+              </w:rPr>
+              <w:t>Las respuestas simuladas se basan en reglas locales predefinidas y no usan IA en vivo.</w:t>
             </w:r>
           </w:p>
         </w:tc>
@@ -16139,11 +16087,13 @@
               <w:spacing w:after="480" w:line="276" w:lineRule="auto"/>
               <w:rPr/>
             </w:pPr>
-            <w:r>
-              <w:rPr>
-                <w:rtl w:val="0"/>
-              </w:rPr>
-              <w:t xml:space="preserve">Descartada</w:t>
+            <w:r/>
+            <w:r>
+              <w:rPr>
+                <w:rFonts w:ascii="Arial" w:hAnsi="Arial"/>
+                <w:sz w:val="20"/>
+              </w:rPr>
+              <w:t>Seleccionada</w:t>
             </w:r>
           </w:p>
         </w:tc>
@@ -16175,11 +16125,13 @@
               <w:spacing w:after="480" w:line="276" w:lineRule="auto"/>
               <w:rPr/>
             </w:pPr>
-            <w:r>
-              <w:rPr>
-                <w:rtl w:val="0"/>
-              </w:rPr>
-              <w:t xml:space="preserve">No responder ante baja confianza</w:t>
+            <w:r/>
+            <w:r>
+              <w:rPr>
+                <w:rFonts w:ascii="Arial" w:hAnsi="Arial"/>
+                <w:sz w:val="20"/>
+              </w:rPr>
+              <w:t>Reintentos síncronos continuos</w:t>
             </w:r>
           </w:p>
         </w:tc>
@@ -16204,11 +16156,13 @@
               <w:spacing w:after="480" w:line="276" w:lineRule="auto"/>
               <w:rPr/>
             </w:pPr>
-            <w:r>
-              <w:rPr>
-                <w:rtl w:val="0"/>
-              </w:rPr>
-              <w:t xml:space="preserve">Reduce clasificaciones erróneas</w:t>
+            <w:r/>
+            <w:r>
+              <w:rPr>
+                <w:rFonts w:ascii="Arial" w:hAnsi="Arial"/>
+                <w:sz w:val="20"/>
+              </w:rPr>
+              <w:t>Intenta restablecer el canal de comunicación con la API externa para obtener el análisis real.</w:t>
             </w:r>
           </w:p>
         </w:tc>
@@ -16233,11 +16187,13 @@
               <w:spacing w:after="480" w:line="276" w:lineRule="auto"/>
               <w:rPr/>
             </w:pPr>
-            <w:r>
-              <w:rPr>
-                <w:rtl w:val="0"/>
-              </w:rPr>
-              <w:t xml:space="preserve">Deja al usuario sin orientación útil</w:t>
+            <w:r/>
+            <w:r>
+              <w:rPr>
+                <w:rFonts w:ascii="Arial" w:hAnsi="Arial"/>
+                <w:sz w:val="20"/>
+              </w:rPr>
+              <w:t>Incrementa drásticamente la latencia total del flujo de verificación superando el umbral de los 40 segundos.</w:t>
             </w:r>
           </w:p>
         </w:tc>
@@ -16262,11 +16218,13 @@
               <w:spacing w:after="480" w:line="276" w:lineRule="auto"/>
               <w:rPr/>
             </w:pPr>
-            <w:r>
-              <w:rPr>
-                <w:rtl w:val="0"/>
-              </w:rPr>
-              <w:t xml:space="preserve">Descartada</w:t>
+            <w:r/>
+            <w:r>
+              <w:rPr>
+                <w:rFonts w:ascii="Arial" w:hAnsi="Arial"/>
+                <w:sz w:val="20"/>
+              </w:rPr>
+              <w:t>Descartada</w:t>
             </w:r>
           </w:p>
         </w:tc>
@@ -16298,11 +16256,13 @@
               <w:spacing w:after="480" w:line="276" w:lineRule="auto"/>
               <w:rPr/>
             </w:pPr>
-            <w:r>
-              <w:rPr>
-                <w:rtl w:val="0"/>
-              </w:rPr>
-              <w:t xml:space="preserve">Veredicto con confianza, contexto y recomendación</w:t>
+            <w:r/>
+            <w:r>
+              <w:rPr>
+                <w:rFonts w:ascii="Arial" w:hAnsi="Arial"/>
+                <w:sz w:val="20"/>
+              </w:rPr>
+              <w:t>Inhibición del servicio y respuesta con código de error</w:t>
             </w:r>
           </w:p>
         </w:tc>
@@ -16327,11 +16287,13 @@
               <w:spacing w:after="480" w:line="276" w:lineRule="auto"/>
               <w:rPr/>
             </w:pPr>
-            <w:r>
-              <w:rPr>
-                <w:rtl w:val="0"/>
-              </w:rPr>
-              <w:t xml:space="preserve">Equilibra transparencia, utilidad y control del riesgo</w:t>
+            <w:r/>
+            <w:r>
+              <w:rPr>
+                <w:rFonts w:ascii="Arial" w:hAnsi="Arial"/>
+                <w:sz w:val="20"/>
+              </w:rPr>
+              <w:t>Evita entregar veredictos basados en reglas locales predefinidas.</w:t>
             </w:r>
           </w:p>
         </w:tc>
@@ -16356,11 +16318,13 @@
               <w:spacing w:after="480" w:line="276" w:lineRule="auto"/>
               <w:rPr/>
             </w:pPr>
-            <w:r>
-              <w:rPr>
-                <w:rtl w:val="0"/>
-              </w:rPr>
-              <w:t xml:space="preserve">Requiere una salida NLP más estructurada</w:t>
+            <w:r/>
+            <w:r>
+              <w:rPr>
+                <w:rFonts w:ascii="Arial" w:hAnsi="Arial"/>
+                <w:sz w:val="20"/>
+              </w:rPr>
+              <w:t>Deja al bot fuera de servicio ante cualquier caída externa, perdiendo la continuidad operativa.</w:t>
             </w:r>
           </w:p>
         </w:tc>
@@ -16385,11 +16349,13 @@
               <w:spacing w:after="480" w:line="276" w:lineRule="auto"/>
               <w:rPr/>
             </w:pPr>
-            <w:r>
-              <w:rPr>
-                <w:rtl w:val="0"/>
-              </w:rPr>
-              <w:t xml:space="preserve">Seleccionada</w:t>
+            <w:r/>
+            <w:r>
+              <w:rPr>
+                <w:rFonts w:ascii="Arial" w:hAnsi="Arial"/>
+                <w:sz w:val="20"/>
+              </w:rPr>
+              <w:t>Descartada</w:t>
             </w:r>
           </w:p>
         </w:tc>

</xml_diff>

<commit_message>
docs: restablece y expande veredictos poco confiables como riesgo principal
</commit_message>
<xml_diff>
--- a/Portafolio_de_Proyecto_hito3_2026.docx
+++ b/Portafolio_de_Proyecto_hito3_2026.docx
@@ -15463,7 +15463,7 @@
           <w:rFonts w:ascii="Arial" w:hAnsi="Arial"/>
           <w:sz w:val="22"/>
         </w:rPr>
-        <w:t>La mitigación del riesgo técnico se focaliza en un imperativo crítico para el éxito del MVP Bot Verificador X: la posibilidad de una falla de integración en los protocolos de comunicación entre el entorno de X, el backend Express y el servicio externo de NLP/IA (Gemini). Si alguna de estas conexiones sufre latencia extrema o indisponibilidad física, el flujo transaccional colapsaría, impidiendo emitir respuestas automáticas y afectando la disponibilidad operativa del bot.</w:t>
+        <w:t>La mitigación del riesgo técnico se focaliza en el imperativo crítico fundamental para el éxito y sustentabilidad del MVP Bot Verificador X: la posibilidad de que el motor de análisis cognitivo NLP/IA emita veredictos poco confiables, erróneos, descontextualizados o excesivamente simplificados frente a publicaciones ciudadanas de alta sensibilidad. Este riesgo representa la mayor amenaza sistémica del proyecto, dado que una clasificación incorrecta (como catalogar información verdadera como falsa, o viceversa) tiene repercusiones sumamente graves. Entre estas repercusiones destacan: la pérdida irreversible de confianza y credibilidad del bot por parte de los usuarios en la red social X, la posibilidad de generar conflictos de difamación o desinformación secundaria en periodos de alta tensión social o política en Chile, y la propagación de una falsa certidumbre en los ciudadanos que confían ciegamente en el veredicto automatizado, actuando en sentido opuesto al objetivo original de saneamiento del ecosistema digital.</w:t>
       </w:r>
     </w:p>
     <w:p>
@@ -15477,7 +15477,7 @@
           <w:rFonts w:ascii="Arial" w:hAnsi="Arial"/>
           <w:sz w:val="22"/>
         </w:rPr>
-        <w:t>Para mitigar este escenario de falla de integración, la arquitectura del sistema implementa un temporizador asíncrono estructurado con reintentos rápidos y conmutación automática (fallback) en caliente. Si el canal externo falla de forma persistente, el orquestador desvía la consulta hacia un simulador local en memoria dotado de análisis semántico, garantizando que el bot nunca quede inactivo y mantenga una disponibilidad de respuesta estable ante caídas de red externas.</w:t>
+        <w:t>Este riesgo es catalogado como el principal debido a que incide directamente sobre la propuesta de valor de la solución tecnológica. Si el sistema entrega respuestas sin el contexto sociocultural y político suficiente, o falla en reconocer la jerga y el sarcasmo característicos del debate chileno, la herramienta se convertirá en un vector de desinformación adicional en lugar de un agente de validación de cero fricción. Para mitigar esta vulnerabilidad, la estrategia no se restringe a la mera sintonía de los pesos de la API generativa de Gemini o a la captura lineal de scrapings; exige estructurar una arquitectura de datos que entregue obligatoriamente un desglose metodológico (veredicto, nivel de certidumbre porcentual, dominio temático, justificación contextual y señales de alerta específicas), forzando al usuario a desarrollar un pensamiento crítico en lugar de aceptar un veredicto puramente binario.</w:t>
       </w:r>
     </w:p>
     <w:p>
@@ -15658,7 +15658,7 @@
                 <w:rFonts w:ascii="Arial" w:hAnsi="Arial"/>
                 <w:sz w:val="20"/>
               </w:rPr>
-              <w:t>Falla de integración entre X, backend y servicio NLP/IA</w:t>
+              <w:t>Veredictos poco confiables o sin contexto suficiente</w:t>
             </w:r>
           </w:p>
         </w:tc>
@@ -15675,7 +15675,7 @@
                 <w:rFonts w:ascii="Arial" w:hAnsi="Arial"/>
                 <w:sz w:val="20"/>
               </w:rPr>
-              <w:t>Incompatibilidad o desconexión en los protocolos de comunicación entre la API de X, el servidor backend Express y la API externa del servicio de NLP/IA (Gemini), provocando la interrupción del flujo transaccional y la imposibilidad de responder al usuario.</w:t>
+              <w:t>Emisión de clasificaciones incorrectas o carentes de respaldo contextual sociopolítico por parte del motor NLP/IA. Esto puede desencadenar la pérdida total de credibilidad del bot, inducir a una falsa certidumbre en los ciudadanos ante noticias falsas y amplificar la desinformación en la red social X.</w:t>
             </w:r>
           </w:p>
         </w:tc>
@@ -15744,7 +15744,7 @@
           <w:rFonts w:ascii="Arial" w:hAnsi="Arial"/>
           <w:sz w:val="22"/>
         </w:rPr>
-        <w:t>Con el propósito de determinar la estrategia de mitigación de mayor efectividad ante una falla de integración, se sometieron a evaluación diversas alternativas técnicas. La primera opción estratégica consistía en programar reintentos sínconos continuos de la petición HTTP hacia la API externa. Si bien esta alternativa busca persistir en la conexión real con Gemini, se determinó que incrementa drásticamente la latencia total del flujo de verificación superando el umbral de los 40 segundos, bloqueando recursos del servidor Express ante altas demandas.</w:t>
+        <w:t>Con el propósito de determinar la estrategia de mitigación de mayor efectividad ante la emisión de veredictos poco confiables o carentes de contexto, se sometieron a análisis diversas alternativas de diseño de software. La primera opción estratégica consistía en limitar la salida del bot a una respuesta rígida y binaria (etiquetas directas de 'Verdadero' o 'Falso' sin explicaciones de respaldo). Aunque esta alternativa optimiza la latencia del flujo de red y la complejidad del backend Express, se determinó que incrementa significativamente el riesgo de veredictos poco confiables, ya que no ofrece al ciudadano el sustento racional ni las fuentes necesarias para validar de manera autónoma la información, restándole todo rigor ingenieril al MVP.</w:t>
       </w:r>
     </w:p>
     <w:p>
@@ -15758,7 +15758,7 @@
           <w:rFonts w:ascii="Arial" w:hAnsi="Arial"/>
           <w:sz w:val="22"/>
         </w:rPr>
-        <w:t>Una segunda alternativa evaluada contemplaba suspender el servicio y responder con un mensaje de error genérico al usuario ante fallas en los sockets externos. Aunque esta medida es simple y evita entregar veredictos basados en reglas locales predefinidas, afecta negativamente la propuesta de valor y utilidad de cero fricción del bot, dejando al usuario desatendido precisamente ante contingencias operativas.</w:t>
+        <w:t>Una segunda alternativa evaluada contemplaba la inhibición total de la respuesta automatizada (el bot permanece en silencio y no responde el hilo de X) en aquellos escenarios donde el motor NLP o el raspado de DuckDuckGo retornaran un umbral de confianza inferior al 85%. Si bien esta medida neutraliza el riesgo de emitir clasificaciones erróneas ante afirmaciones dudosas o ambiguas, afecta de forma crítica la utilidad práctica y el engagement del software. Esto se debe a que deja al ciudadano desprovisto de orientación precisamente en situaciones de máxima incertidumbre social, donde la necesidad de una validación asistida es más imperativa para frenar la propagación por clics impulsivos.</w:t>
       </w:r>
     </w:p>
     <w:p>
@@ -15772,7 +15772,7 @@
           <w:rFonts w:ascii="Arial" w:hAnsi="Arial"/>
           <w:sz w:val="22"/>
         </w:rPr>
-        <w:t>La tercera alternativa, adoptada formalmente para el desarrollo del prototipo de ingeniería, integra un timeout agresivo con AbortController, conmutación rápida a un simulador semántico en memoria y persistencia de desvío asíncrono para las métricas en caso de indisponibilidad de PostgreSQL. Esta estrategia fue seleccionada debido a que equilibra la continuidad del servicio, garantiza respuestas en menos de 5 segundos ante fallas de red y previene la pérdida de trazas operacionales.</w:t>
+        <w:t>La tercera alternativa, adoptada formalmente para la implementación final del prototipo, consiste en el diseño de un motor híbrido que combina la inyección contextual RAG, umbrales de confianza dinámicos y una plantilla de salida estructurada JSON obligatoria en el adaptador de NLP. Bajo esta arquitectura, si el motor de Gemini arroja certidumbre baja o media, el bot no se silencia ni entrega una etiqueta categórica; en su lugar, asigna el veredicto de 'Impreciso' y despliega de manera estructurada el dominio, el contexto del hecho y una recomendación de cautela. Esta estrategia fue seleccionada debido a que equilibra con éxito la utilidad operacional de la herramienta con el control del riesgo reputacional y la resiliencia del software.</w:t>
       </w:r>
     </w:p>
     <w:p>
@@ -16000,7 +16000,7 @@
                 <w:rFonts w:ascii="Arial" w:hAnsi="Arial"/>
                 <w:sz w:val="20"/>
               </w:rPr>
-              <w:t>Fallback automático a simulador local en memoria</w:t>
+              <w:t>Respuesta rígida o binaria (Verdadero/Falso)</w:t>
             </w:r>
           </w:p>
         </w:tc>
@@ -16031,7 +16031,7 @@
                 <w:rFonts w:ascii="Arial" w:hAnsi="Arial"/>
                 <w:sz w:val="20"/>
               </w:rPr>
-              <w:t>Garantiza la respuesta operativa del bot ante caídas de red de la API externa (Gemini/X).</w:t>
+              <w:t>Implementación sencilla en el backend y latencia mínima de respuesta.</w:t>
             </w:r>
           </w:p>
         </w:tc>
@@ -16062,7 +16062,7 @@
                 <w:rFonts w:ascii="Arial" w:hAnsi="Arial"/>
                 <w:sz w:val="20"/>
               </w:rPr>
-              <w:t>Las respuestas simuladas se basan en reglas locales predefinidas y no usan IA en vivo.</w:t>
+              <w:t>No dota al usuario de explicaciones contextuales ni promueve el pensamiento crítico.</w:t>
             </w:r>
           </w:p>
         </w:tc>
@@ -16093,7 +16093,7 @@
                 <w:rFonts w:ascii="Arial" w:hAnsi="Arial"/>
                 <w:sz w:val="20"/>
               </w:rPr>
-              <w:t>Seleccionada</w:t>
+              <w:t>Descartada</w:t>
             </w:r>
           </w:p>
         </w:tc>
@@ -16131,7 +16131,7 @@
                 <w:rFonts w:ascii="Arial" w:hAnsi="Arial"/>
                 <w:sz w:val="20"/>
               </w:rPr>
-              <w:t>Reintentos síncronos continuos</w:t>
+              <w:t>Inhibición de respuesta ante confianza inferior al 85%</w:t>
             </w:r>
           </w:p>
         </w:tc>
@@ -16162,7 +16162,7 @@
                 <w:rFonts w:ascii="Arial" w:hAnsi="Arial"/>
                 <w:sz w:val="20"/>
               </w:rPr>
-              <w:t>Intenta restablecer el canal de comunicación con la API externa para obtener el análisis real.</w:t>
+              <w:t>Elimina el riesgo de propagar clasificaciones erróneas ante alta incertidumbre.</w:t>
             </w:r>
           </w:p>
         </w:tc>
@@ -16193,7 +16193,7 @@
                 <w:rFonts w:ascii="Arial" w:hAnsi="Arial"/>
                 <w:sz w:val="20"/>
               </w:rPr>
-              <w:t>Incrementa drásticamente la latencia total del flujo de verificación superando el umbral de los 40 segundos.</w:t>
+              <w:t>Deja al ciudadano sin asistencia ni orientación en los momentos de mayor duda.</w:t>
             </w:r>
           </w:p>
         </w:tc>
@@ -16262,7 +16262,7 @@
                 <w:rFonts w:ascii="Arial" w:hAnsi="Arial"/>
                 <w:sz w:val="20"/>
               </w:rPr>
-              <w:t>Inhibición del servicio y respuesta con código de error</w:t>
+              <w:t>Veredicto estructurado con dominio, justificación y señales</w:t>
             </w:r>
           </w:p>
         </w:tc>
@@ -16293,7 +16293,7 @@
                 <w:rFonts w:ascii="Arial" w:hAnsi="Arial"/>
                 <w:sz w:val="20"/>
               </w:rPr>
-              <w:t>Evita entregar veredictos basados en reglas locales predefinidas.</w:t>
+              <w:t>Maximiza la transparencia del análisis cognitivo y fomenta el pensamiento crítico.</w:t>
             </w:r>
           </w:p>
         </w:tc>
@@ -16324,7 +16324,7 @@
                 <w:rFonts w:ascii="Arial" w:hAnsi="Arial"/>
                 <w:sz w:val="20"/>
               </w:rPr>
-              <w:t>Deja al bot fuera de servicio ante cualquier caída externa, perdiendo la continuidad operativa.</w:t>
+              <w:t>Requiere un parsing JSON estricto y adaptadores de red robustecidos ante timeouts.</w:t>
             </w:r>
           </w:p>
         </w:tc>
@@ -16355,7 +16355,7 @@
                 <w:rFonts w:ascii="Arial" w:hAnsi="Arial"/>
                 <w:sz w:val="20"/>
               </w:rPr>
-              <w:t>Descartada</w:t>
+              <w:t>Seleccionada</w:t>
             </w:r>
           </w:p>
         </w:tc>

</xml_diff>

<commit_message>
docs: reformula riesgo principal con lenguaje tecnico fino de NLP e IA
</commit_message>
<xml_diff>
--- a/Portafolio_de_Proyecto_hito3_2026.docx
+++ b/Portafolio_de_Proyecto_hito3_2026.docx
@@ -15463,7 +15463,7 @@
           <w:rFonts w:ascii="Arial" w:hAnsi="Arial"/>
           <w:sz w:val="22"/>
         </w:rPr>
-        <w:t>La mitigación del riesgo técnico se focaliza en el imperativo crítico fundamental para el éxito y sustentabilidad del MVP Bot Verificador X: la posibilidad de que el motor de análisis cognitivo NLP/IA emita veredictos poco confiables, erróneos, descontextualizados o excesivamente simplificados frente a publicaciones ciudadanas de alta sensibilidad. Este riesgo representa la mayor amenaza sistémica del proyecto, dado que una clasificación incorrecta (como catalogar información verdadera como falsa, o viceversa) tiene repercusiones sumamente graves. Entre estas repercusiones destacan: la pérdida irreversible de confianza y credibilidad del bot por parte de los usuarios en la red social X, la posibilidad de generar conflictos de difamación o desinformación secundaria en periodos de alta tensión social o política en Chile, y la propagación de una falsa certidumbre en los ciudadanos que confían ciegamente en el veredicto automatizado, actuando en sentido opuesto al objetivo original de saneamiento del ecosistema digital.</w:t>
+        <w:t>La mitigación del riesgo técnico se focaliza en el imperativo crítico fundamental para el éxito y sustentabilidad del MVP Bot Verificador X: la generación de respuestas de verificación imprecisas, descontextualizadas o insuficientemente justificadas por parte del motor cognitivo NLP/IA. Este riesgo representa la mayor amenaza para el proyecto, dado que un veredicto erróneo o una respuesta carente de fundamento explicativo no solo anula la propuesta de valor de la herramienta, sino que puede inducir a una falsa certidumbre en los ciudadanos, amplificar la propagación de desinformación secundaria en periodos de contingencia y socavar irreversiblemente la credibilidad técnica y reputacional del agente de software.</w:t>
       </w:r>
     </w:p>
     <w:p>
@@ -15477,7 +15477,7 @@
           <w:rFonts w:ascii="Arial" w:hAnsi="Arial"/>
           <w:sz w:val="22"/>
         </w:rPr>
-        <w:t>Este riesgo es catalogado como el principal debido a que incide directamente sobre la propuesta de valor de la solución tecnológica. Si el sistema entrega respuestas sin el contexto sociocultural y político suficiente, o falla en reconocer la jerga y el sarcasmo característicos del debate chileno, la herramienta se convertirá en un vector de desinformación adicional en lugar de un agente de validación de cero fricción. Para mitigar esta vulnerabilidad, la estrategia no se restringe a la mera sintonía de los pesos de la API generativa de Gemini o a la captura lineal de scrapings; exige estructurar una arquitectura de datos que entregue obligatoriamente un desglose metodológico (veredicto, nivel de certidumbre porcentual, dominio temático, justificación contextual y señales de alerta específicas), forzando al usuario a desarrollar un pensamiento crítico en lugar de aceptar un veredicto puramente binario.</w:t>
+        <w:t>Este riesgo es catalogado como el principal debido a que incide de manera directa en la utilidad social de la solución tecnológica. Para controlarlo, la infraestructura del prototipo del Hito 3 utiliza la integración técnica como el soporte de ingeniería que garantiza la calidad del veredicto. Esto se logra mediante el diseño de un motor híbrido que combina la inyección de contexto en vivo vía RAG (scraping asíncrono de DuckDuckGo HTML) para evitar alucinaciones, y la imposición de un contrato estricto de datos en formato JSON hacia la API oficial de Gemini. Asimismo, para mitigar las caídas de sockets y fallas de latencia externa en red, se implementó un timeout con AbortController (2 segundos) y una conmutación automática (fallback) en caliente hacia el simulador semántico en memoria, asegurando que el bot siempre entregue una respuesta estructural y metodológicamente validada.</w:t>
       </w:r>
     </w:p>
     <w:p>
@@ -15658,7 +15658,7 @@
                 <w:rFonts w:ascii="Arial" w:hAnsi="Arial"/>
                 <w:sz w:val="20"/>
               </w:rPr>
-              <w:t>Veredictos poco confiables o sin contexto suficiente</w:t>
+              <w:t>Generación de respuestas de verificación imprecisas, descontextualizadas o insuficientemente justificadas</w:t>
             </w:r>
           </w:p>
         </w:tc>
@@ -15675,7 +15675,7 @@
                 <w:rFonts w:ascii="Arial" w:hAnsi="Arial"/>
                 <w:sz w:val="20"/>
               </w:rPr>
-              <w:t>Emisión de clasificaciones incorrectas o carentes de respaldo contextual sociopolítico por parte del motor NLP/IA. Esto puede desencadenar la pérdida total de credibilidad del bot, inducir a una falsa certidumbre en los ciudadanos ante noticias falsas y amplificar la desinformación en la red social X.</w:t>
+              <w:t>Emisión de veredictos erróneos o carentes de respaldo contextual y documental en el flujo NLP/IA, comprometiendo la credibilidad del agente. Se mitiga mediante una arquitectura híbrida RAG (Gemini + búsqueda DuckDuckGo), contratos JSON estrictos, timeouts asíncronos con AbortController y conmutación automática a simulación local.</w:t>
             </w:r>
           </w:p>
         </w:tc>

</xml_diff>

<commit_message>
docs: elimina terminologia grandilocuente, 99.9% y v1.0.0 de entregable
</commit_message>
<xml_diff>
--- a/Portafolio_de_Proyecto_hito3_2026.docx
+++ b/Portafolio_de_Proyecto_hito3_2026.docx
@@ -6521,9 +6521,11 @@
       </w:pPr>
       <w:r>
         <w:rPr>
-          <w:rtl w:val="0"/>
-        </w:rPr>
-        <w:t xml:space="preserve">Disponibilidad (Uptime): Garantizar un 99.9% de tiempo en línea de la infraestructura cloud.</w:t>
+          <w:rFonts w:ascii="Arial" w:hAnsi="Arial"/>
+          <w:sz w:val="22"/>
+          <w:rtl w:val="0"/>
+        </w:rPr>
+        <w:t>Disponibilidad (Uptime): Garantizar la alta disponibilidad en entorno controlado de la infraestructura cloud.</w:t>
       </w:r>
     </w:p>
     <w:p>
@@ -6640,7 +6642,7 @@
           <w:rFonts w:ascii="Arial" w:hAnsi="Arial"/>
           <w:sz w:val="22"/>
         </w:rPr>
-        <w:t>El núcleo de procesamiento del Bot Verificador X implementa un motor híbrido sustentado en técnicas de Retrieval-Augmented Generation (RAG). Este componente integra un adaptador de búsqueda asíncrona que raspa dinámicamente resultados web de DuckDuckGo en tiempo real para recopilar evidencias sobre el 'día a día' de internet, inyectándolas como contexto delimitado a la API oficial de Google Gemini 2.5 Flash. El motor generativo procesa la consulta bajo un contrato de datos estricto en formato JSON (veredicto, nivel de confianza y justificaciones). Si esta consulta sufre latencias críticas, el adaptador aborta la petición de red mediante AbortController (2 segundos) y ejecuta reintentos rápidos, conmutando ante fallas persistentes a un simulador semántico local en memoria robustecido con lógica de negaciones sintácticas, garantizando que el bot entregue siempre un veredicto controlado y mantenga un 99.9% de disponibilidad.</w:t>
+        <w:t>El núcleo de procesamiento del Bot Verificador X implementa un motor híbrido sustentado en técnicas de Retrieval-Augmented Generation (RAG). Este componente integra un adaptador de búsqueda asíncrona que raspa dinámicamente resultados web de DuckDuckGo en tiempo real para recopilar evidencias sobre el 'día a día' de internet, inyectándolas como contexto delimitado a la API oficial de Google Gemini 2.5 Flash. El motor generativo procesa la consulta bajo un contrato de datos estricto en formato JSON (veredicto, nivel de confianza y justificaciones). Si esta consulta sufre latencias críticas, el adaptador aborta la petición de red mediante AbortController (2 segundos) y ejecuta reintentos rápidos, conmutando ante fallas persistentes a un simulador semántico local en memoria robustecido con lógica de negaciones sintácticas, garantizando que el bot entregue siempre un veredicto controlado y mantenga su disponibilidad operativa mediante fallback.</w:t>
       </w:r>
     </w:p>
     <w:p>
@@ -8602,9 +8604,11 @@
       </w:pPr>
       <w:r>
         <w:rPr>
-          <w:rtl w:val="0"/>
-        </w:rPr>
-        <w:t xml:space="preserve">En la presente fase del desarrollo, la propuesta de solución evoluciona desde su fundamentación funcional hacia una arquitectura técnica de alto nivel orientada a la validación del Producto Mínimo Viable (MVP). El </w:t>
+          <w:rFonts w:ascii="Arial" w:hAnsi="Arial"/>
+          <w:sz w:val="22"/>
+          <w:rtl w:val="0"/>
+        </w:rPr>
+        <w:t>En la presente fase del desarrollo, la propuesta de solución evoluciona desde su fundamentación funcional hacia una arquitectura técnica de alto nivel orientada a la validación del Producto Mínimo Viable (MVP). El Bot Verificador X se constituye como un agente automatizado integrado orgánicamente en la red social, diseñado para capturar menciones ciudadanas en publicaciones de carácter dudoso. Físicamente, el sistema orquesta la extracción de contenidos y su posterior procesamiento cognitivo mediante modelos de Natural Language Processing (NLP), permitiendo la emisión de respuestas inmediatas que integran el veredicto, umbrales de certidumbre y una justificación técnica exhaustiva. Asimismo, la arquitectura garantiza la persistencia asíncrona de métricas operacionales, asegurando la trazabilidad estructurada del desempeño y la latencia transaccional del flujo de verificación.</w:t>
       </w:r>
       <w:r>
         <w:rPr>
@@ -8612,13 +8616,11 @@
           <w:bCs w:val="1"/>
           <w:rtl w:val="0"/>
         </w:rPr>
-        <w:t xml:space="preserve">Bot Verificador X</w:t>
-      </w:r>
-      <w:r>
-        <w:rPr>
-          <w:rtl w:val="0"/>
-        </w:rPr>
-        <w:t xml:space="preserve"> se constituye como un agente automatizado integrado orgánicamente en la red social, diseñado para capturar menciones ciudadanas en publicaciones de carácter dudoso. Físicamente, el sistema orquesta la extracción de contenidos y su posterior procesamiento cognitivo mediante modelos de </w:t>
+      </w:r>
+      <w:r>
+        <w:rPr>
+          <w:rtl w:val="0"/>
+        </w:rPr>
       </w:r>
       <w:r>
         <w:rPr>
@@ -8626,13 +8628,11 @@
           <w:iCs w:val="1"/>
           <w:rtl w:val="0"/>
         </w:rPr>
-        <w:t xml:space="preserve">Natural Language Processing</w:t>
-      </w:r>
-      <w:r>
-        <w:rPr>
-          <w:rtl w:val="0"/>
-        </w:rPr>
-        <w:t xml:space="preserve"> (NLP), permitiendo la emisión de respuestas inmediatas que integran el veredicto, umbrales de certidumbre y una justificación técnica exhaustiva. Asimismo, la arquitectura garantiza la persistencia asíncrona de métricas operacionales, asegurando la trazabilidad absoluta del desempeño y la latencia transaccional del flujo de verificación.</w:t>
+      </w:r>
+      <w:r>
+        <w:rPr>
+          <w:rtl w:val="0"/>
+        </w:rPr>
       </w:r>
       <w:r>
         <w:rPr>
@@ -18338,7 +18338,7 @@
           <w:rFonts w:ascii="Arial" w:hAnsi="Arial"/>
           <w:sz w:val="22"/>
         </w:rPr>
-        <w:t>El diseño técnico detallado de esta iteración consolidó el patrón de Inyección de Dependencias para aislar la lógica de negocio del bot. Al recibir una mención HTTP en el endpoint `/x/webhook`, el enrutador delegó la petición al servicio orquestador principal (`verificationService.js`). Este componente se encarga de iniciar el preprocesamiento del texto, removiendo menciones de usuario mediante expresiones regulares complejas para evitar ruido conceptual, y de coordinar el ciclo RAG a través del adaptador de red (`nlpAdapter.js`). Dicho adaptador realiza consultas en vivo sobre DuckDuckGo HTML y alimenta el motor generativo de Gemini 2.5 Flash. Para garantizar la resiliencia en red, se instrumentó un temporizador asíncrono con `AbortController` (2 segundos de timeout) y una política recursiva de reintentos limitados (2). Si el canal externo falla, el orquestador conmuta en caliente hacia la clase `nlpSimulator.js`, un motor de reglas en memoria dotado de análisis semántico para evaluar afirmaciones estáticas locales y procesar negaciones lógicas complejas (como 'nunca' o 'no es'). Finalmente, la traza de auditoría es guardada en PostgreSQL 15 a través del repositorio de base de datos (`metricsRepository.js`). Ante caídas físicas del daemon de Docker o fallos de sockets relacionales, el pool asíncrono del backend captura el error y almacena temporalmente los datos en una cola de memoria volátil local, asegurando la continuidad total del servicio Express (99.9% de uptime) sin pérdidas de datos operacionales.</w:t>
+        <w:t>El diseño técnico detallado de esta iteración consolidó el patrón de Inyección de Dependencias para aislar la lógica de negocio del bot. Al recibir una mención HTTP en el endpoint `/x/webhook`, el enrutador delegó la petición al servicio orquestador principal (`verificationService.js`). Este componente se encarga de iniciar el preprocesamiento del texto, removiendo menciones de usuario mediante expresiones regulares complejas para evitar ruido conceptual, y de coordinar el ciclo RAG a través del adaptador de red (`nlpAdapter.js`). Dicho adaptador realiza consultas en vivo sobre DuckDuckGo HTML y alimenta el motor generativo de Gemini 2.5 Flash. Para garantizar la resiliencia en red, se instrumentó un temporizador asíncrono con `AbortController` (2 segundos de timeout) y una política recursiva de reintentos limitados (2). Si el canal externo falla, el orquestador conmuta en caliente hacia la clase `nlpSimulator.js`, un motor de reglas en memoria dotado de análisis semántico para evaluar afirmaciones estáticas locales y procesar negaciones lógicas complejas (como 'nunca' o 'no es'). Finalmente, la traza de auditoría es guardada en PostgreSQL 15 a través del repositorio de base de datos (`metricsRepository.js`). Ante caídas físicas del daemon de Docker o fallos de sockets relacionales, el pool asíncrono del backend captura el error y almacena temporalmente los datos en una cola de memoria volátil local, asegurando la continuidad del servicio Express mediante fallback en caliente sin pérdidas de datos operacionales.</w:t>
       </w:r>
     </w:p>
     <w:p>
@@ -18478,7 +18478,7 @@
           <w:rFonts w:ascii="Arial" w:hAnsi="Arial"/>
           <w:sz w:val="22"/>
         </w:rPr>
-        <w:t>La liberación definitiva del software se concretó con el lanzamiento de la versión v1.0.0 en GitHub. Este incremento final representa el MVP consolidado con su orquestación Docker Compose (Node.js backend + PostgreSQL 15 relacional), los adaptadores resilientes independientes, el motor NLP adaptativo de scraping y Gemini, la suite Jest con pruebas de conmutación de red y base de datos, y el dashboard web interactivo premium listo para la demostración ante los evaluadores.</w:t>
+        <w:t>La liberación definitiva del software se concretó con el lanzamiento de la versión final del prototipo en GitHub. Este incremento final representa el MVP consolidado con su orquestación Docker Compose (Node.js backend + PostgreSQL 15 relacional), los adaptadores resilientes independientes, el motor NLP adaptativo de scraping y Gemini, la suite Jest con pruebas de conmutación de red y base de datos, y el dashboard web interactivo premium listo para la demostración ante los evaluadores.</w:t>
       </w:r>
     </w:p>
     <w:p>
@@ -18504,7 +18504,7 @@
           <w:rFonts w:ascii="Arial" w:hAnsi="Arial"/>
           <w:sz w:val="22"/>
         </w:rPr>
-        <w:t>El único problema abierto y residual identificado al término del proyecto consiste en la transición operativa de las credenciales sandbox simuladas locales hacia llaves de API comerciales de producción en la plataforma X Enterprise, y el despliegue físico de la base de datos PostgreSQL en AWS RDS y el servidor Express en contenedores AWS Fargate dentro de una VPC segura con variables en AWS Secrets Manager.</w:t>
+        <w:t>El único problema abierto y residual identificado al término del proyecto consiste en la transición operativa de las credenciales sandbox simuladas locales hacia llaves de API comerciales de producción en la plataforma X (API comercial), y el despliegue físico de la base de datos PostgreSQL en AWS RDS y el servidor Express en contenedores AWS Fargate dentro de una VPC segura con variables en AWS Secrets Manager.</w:t>
       </w:r>
     </w:p>
     <w:p>
@@ -18530,7 +18530,7 @@
           <w:rFonts w:ascii="Arial" w:hAnsi="Arial"/>
           <w:sz w:val="22"/>
         </w:rPr>
-        <w:t>1. Integración productiva real mediante API v2 comercial de X y credenciales enterprise en AWS Secrets Manager para operar en producción sin simulaciones locales.</w:t>
+        <w:t>1. Integración productiva real mediante API v2 comercial de X y credenciales de producción en AWS Secrets Manager para operar en producción sin simulaciones locales.</w:t>
       </w:r>
     </w:p>
     <w:p>
@@ -18580,7 +18580,7 @@
           <w:rFonts w:ascii="Arial" w:hAnsi="Arial"/>
           <w:sz w:val="22"/>
         </w:rPr>
-        <w:t>El desarrollo y ejecución del Producto Mínimo Viable (MVP) "Bot Verificador X" demuestra de manera concluyente la viabilidad técnica de implementar agentes automatizados para la mitigación de la desinformación en redes sociales mediante arquitecturas de software modernas. A lo largo del ciclo de vida del proyecto, se logró transformar un proceso de fact-checking tradicionalmente manual, externo y de alta fricción, en una solución de verificación nativa, asíncrona y de respuesta inmediata.</w:t>
+        <w:t>El desarrollo y ejecución del Producto Mínimo Viable (MVP) "Bot Verificador X" demuestra de manera consistente la viabilidad técnica de implementar agentes automatizados para la mitigación de la desinformación en redes sociales mediante arquitecturas de software modernas. A lo largo del ciclo de vida del proyecto, se logró transformar un proceso de fact-checking tradicionalmente manual, externo y de alta fricción, en una solución de verificación nativa, asíncrona y de respuesta inmediata.</w:t>
       </w:r>
     </w:p>
     <w:p>
@@ -18616,7 +18616,7 @@
           <w:rFonts w:ascii="Arial" w:hAnsi="Arial"/>
           <w:sz w:val="22"/>
         </w:rPr>
-        <w:t>Finalmente, este proyecto consolida un producto de software robusto, resiliente y scalable, preparado estructuralmente para transicionar hacia un entorno productivo Enterprise en AWS. La trazabilidad operacional persistida en PostgreSQL y el ecosistema de pruebas automatizadas garantizan que el Bot Verificador X no solo cumple con las métricas de éxito y latencia trazadas en su concepción, sino que establece un estándar técnico profesional para futuras herramientas ciudadanas enfocadas en el saneamiento del ecosistema digital.</w:t>
+        <w:t>Finalmente, este proyecto consolida un producto de software robusto, resiliente y scalable, preparado estructuralmente para transicionar hacia un entorno escalable en la nube en AWS. La trazabilidad operacional persistida en PostgreSQL y el ecosistema de pruebas automatizadas garantizan que el Bot Verificador X no solo cumple con las métricas de éxito y latencia trazadas en su concepción, sino que establece un estándar técnico profesional para futuras herramientas ciudadanas enfocadas en el saneamiento del ecosistema digital.</w:t>
       </w:r>
     </w:p>
     <w:p>

</xml_diff>